<commit_message>
Petition B: request verification of 1st/3rd committee minutes
Co-Authored-By: Claude Opus 5.5 <noreply@anthropic.com>
Claude-Session: https://claude.ai/code/session_01H9b7FFp3sXnkbpWqGcr2Bw
</commit_message>
<xml_diff>
--- a/수사의뢰_진정서_B안_회의록반영.docx
+++ b/수사의뢰_진정서_B안_회의록반영.docx
@@ -782,82 +782,97 @@
           <w:sz w:val="22"/>
           <w:szCs w:val="22"/>
         </w:rPr>
-        <w:t xml:space="preserve">마. 2023년 위원회 회의록에 나타난 자금 운영과 조직</w:t>
-      </w:r>
-    </w:p>
-    <w:p>
-      <w:pPr>
-        <w:ind w:firstLine="220"/>
-        <w:jc w:val="both"/>
-        <w:spacing w:after="120" w:line="360"/>
-      </w:pPr>
-      <w:r>
-        <w:rPr>
-          <w:rFonts w:ascii="바탕" w:eastAsia="바탕" w:hAnsi="바탕" w:cs="바탕"/>
-          <w:sz w:val="22"/>
-          <w:szCs w:val="22"/>
-        </w:rPr>
-        <w:t xml:space="preserve">진정인은 최근 위원회 회의록 2건을 확보하였습니다. 2023. 5. 2.자 「제2차 감곡면환경개선위원회 회의록」에 따르면, 회의는 순정축협한우명품관 1호실에서 열렸고 위원 7명과 순정축협 직원 3명이 출석하였으며, 2023. 1. 17.자 순정축협 공문의 담당자로 기재된 류승우가 사회를 보았습니다(증 제13호증 1~3쪽).</w:t>
-      </w:r>
-    </w:p>
-    <w:p>
-      <w:pPr>
-        <w:ind w:firstLine="220"/>
-        <w:jc w:val="both"/>
-        <w:spacing w:after="120" w:line="360"/>
-      </w:pPr>
-      <w:r>
-        <w:rPr>
-          <w:rFonts w:ascii="바탕" w:eastAsia="바탕" w:hAnsi="바탕" w:cs="바탕"/>
-          <w:sz w:val="22"/>
-          <w:szCs w:val="22"/>
-        </w:rPr>
-        <w:t xml:space="preserve">같은 회의의 의안 제4호 「마을환경개선자금 집행」에서 위원장 박철용은 "자금 용처에 대해 위원님들과 상의해서 결정했으면 한다"고 하였고, 마을기업 대표 김지운은 "순정축협에서 받은 돈을 마을별로 1천만 원씩 나눠주자는 의견도 있으나 이장님들은 받지 않겠다. 하므로 환경개선위원회의 자금으로 운영하는 것도 방안인데 다수결로 결정하자"고 말하였습니다. 또한 원산마을에 수년간 방치된 쓰레기를 220만 원을 들여 치웠다는 발언도 기재되어 있습니다(증 제13호증 5쪽).</w:t>
-      </w:r>
-    </w:p>
-    <w:p>
-      <w:pPr>
-        <w:ind w:firstLine="220"/>
-        <w:jc w:val="both"/>
-        <w:spacing w:after="120" w:line="360"/>
-      </w:pPr>
-      <w:r>
-        <w:rPr>
-          <w:rFonts w:ascii="바탕" w:eastAsia="바탕" w:hAnsi="바탕" w:cs="바탕"/>
-          <w:sz w:val="22"/>
-          <w:szCs w:val="22"/>
-        </w:rPr>
-        <w:t xml:space="preserve">같은 회의의 기타토의사항에서는 다음 주에 법인체 등록 서류를 제출한다는 보고와 함께, 김지운이 "위원장 박철용, 인근 5개 마을의 이장님과 마을기업 김지운을 법인의 임원으로 하고, 법인의 바람직한 발전을 위해서 비상근 임원으로 순정축협 고창인 조합장을 추천한다"고 제안하였고, 참석위원 전원이 박수로 동의하였다고 기재되어 있습니다(증 제13호증 6쪽).</w:t>
-      </w:r>
-    </w:p>
-    <w:p>
-      <w:pPr>
-        <w:ind w:firstLine="220"/>
-        <w:jc w:val="both"/>
-        <w:spacing w:after="120" w:line="360"/>
-      </w:pPr>
-      <w:r>
-        <w:rPr>
-          <w:rFonts w:ascii="바탕" w:eastAsia="바탕" w:hAnsi="바탕" w:cs="바탕"/>
-          <w:sz w:val="22"/>
-          <w:szCs w:val="22"/>
-        </w:rPr>
-        <w:t xml:space="preserve">2023. 8. 30.자 회의록은 회의명을 「2023년 8월 감곡면 5개권역 환경개선위원회(4차)」로 적고 있습니다. 이 회의에서는 감곡면민의 날 행사 예산을 "환경개선위원회 자금"으로 활용하기로 결의하였고, 과종에 필요한 퇴비는 순정축협 자원화센터에, 가공센터는 "추후 순정축협 자원화시설 현대화시" 지원을 요청하기로 하였습니다. 또한 자연가 송완복 대표를 "감곡면 5개권역마을을 대표"하는 촌장으로 선출하고 위원장이 위원으로 위촉하였다고 의결하였습니다(증 제14호증).</w:t>
-      </w:r>
-    </w:p>
-    <w:p>
-      <w:pPr>
-        <w:ind w:firstLine="220"/>
-        <w:jc w:val="both"/>
-        <w:spacing w:after="120" w:line="360"/>
-      </w:pPr>
-      <w:r>
-        <w:rPr>
-          <w:rFonts w:ascii="바탕" w:eastAsia="바탕" w:hAnsi="바탕" w:cs="바탕"/>
-          <w:sz w:val="22"/>
-          <w:szCs w:val="22"/>
-        </w:rPr>
-        <w:t xml:space="preserve">위 회의록에 따르면 ① 위원회는 2023. 5. 2. 이전에 이미 순정축협으로부터 돈을 받아 그 용처를 위원들끼리 정하고 있었고, ② 금원을 지급한 순정축협의 시설에서 축협 직원의 사회로 회의를 열면서 축협 조합장을 위원회 임원으로 추천하였으며, ③ 위원회는 스스로를 "5개권역" 대표 조직으로 운영하였습니다. 다만 회의록의 "순정축협에서 받은 돈"이 1억 원 전부인지 일부인지, 법인 등록과 조합장의 임원 취임이 실제로 이루어졌는지는 회의록만으로 확인되지 않으므로 조사가 필요합니다.</w:t>
+        <w:t>마. 2023년 위원회 회의록에 나타난 자금 운영과 조직</w:t>
+      </w:r>
+    </w:p>
+    <w:p>
+      <w:pPr>
+        <w:ind w:firstLine="220"/>
+        <w:jc w:val="both"/>
+        <w:spacing w:after="120" w:line="360"/>
+      </w:pPr>
+      <w:r>
+        <w:rPr>
+          <w:rFonts w:ascii="바탕" w:eastAsia="바탕" w:hAnsi="바탕" w:cs="바탕"/>
+          <w:sz w:val="22"/>
+          <w:szCs w:val="22"/>
+        </w:rPr>
+        <w:t>진정인은 최근 위원회 회의록 2건을 확보하였습니다. 2023. 5. 2.자 「제2차 감곡면환경개선위원회 회의록」에 따르면, 회의는 순정축협한우명품관 1호실에서 열렸고 위원 7명과 순정축협 직원 3명이 출석하였으며, 2023. 1. 17.자 순정축협 공문의 담당자로 기재된 류승우가 사회를 보았습니다(증 제13호증 1~3쪽).</w:t>
+      </w:r>
+    </w:p>
+    <w:p>
+      <w:pPr>
+        <w:ind w:firstLine="220"/>
+        <w:jc w:val="both"/>
+        <w:spacing w:after="120" w:line="360"/>
+      </w:pPr>
+      <w:r>
+        <w:rPr>
+          <w:rFonts w:ascii="바탕" w:eastAsia="바탕" w:hAnsi="바탕" w:cs="바탕"/>
+          <w:sz w:val="22"/>
+          <w:szCs w:val="22"/>
+        </w:rPr>
+        <w:t>같은 회의의 의안 제4호 「마을환경개선자금 집행」에서 위원장 박철용은 "자금 용처에 대해 위원님들과 상의해서 결정했으면 한다"고 하였고, 마을기업 대표 김지운은 "순정축협에서 받은 돈을 마을별로 1천만 원씩 나눠주자는 의견도 있으나 이장님들은 받지 않겠다. 하므로 환경개선위원회의 자금으로 운영하는 것도 방안인데 다수결로 결정하자"고 말하였습니다. 또한 원산마을에 수년간 방치된 쓰레기를 220만 원을 들여 치웠다는 발언도 기재되어 있습니다(증 제13호증 5쪽).</w:t>
+      </w:r>
+    </w:p>
+    <w:p>
+      <w:pPr>
+        <w:ind w:firstLine="220"/>
+        <w:jc w:val="both"/>
+        <w:spacing w:after="120" w:line="360"/>
+      </w:pPr>
+      <w:r>
+        <w:rPr>
+          <w:rFonts w:ascii="바탕" w:eastAsia="바탕" w:hAnsi="바탕" w:cs="바탕"/>
+          <w:sz w:val="22"/>
+          <w:szCs w:val="22"/>
+        </w:rPr>
+        <w:t>같은 회의의 기타토의사항에서는 다음 주에 법인체 등록 서류를 제출한다는 보고와 함께, 김지운이 "위원장 박철용, 인근 5개 마을의 이장님과 마을기업 김지운을 법인의 임원으로 하고, 법인의 바람직한 발전을 위해서 비상근 임원으로 순정축협 고창인 조합장을 추천한다"고 제안하였고, 참석위원 전원이 박수로 동의하였다고 기재되어 있습니다(증 제13호증 6쪽).</w:t>
+      </w:r>
+    </w:p>
+    <w:p>
+      <w:pPr>
+        <w:ind w:firstLine="220"/>
+        <w:jc w:val="both"/>
+        <w:spacing w:after="120" w:line="360"/>
+      </w:pPr>
+      <w:r>
+        <w:rPr>
+          <w:rFonts w:ascii="바탕" w:eastAsia="바탕" w:hAnsi="바탕" w:cs="바탕"/>
+          <w:sz w:val="22"/>
+          <w:szCs w:val="22"/>
+        </w:rPr>
+        <w:t>2023. 8. 30.자 회의록은 회의명을 「2023년 8월 감곡면 5개권역 환경개선위원회(4차)」로 적고 있습니다. 이 회의에서는 감곡면민의 날 행사 예산을 "환경개선위원회 자금"으로 활용하기로 결의하였고, 과종에 필요한 퇴비는 순정축협 자원화센터에, 가공센터는 "추후 순정축협 자원화시설 현대화시" 지원을 요청하기로 하였습니다. 또한 자연가 송완복 대표를 "감곡면 5개권역마을을 대표"하는 촌장으로 선출하고 위원장이 위원으로 위촉하였다고 의결하였습니다(증 제14호증).</w:t>
+      </w:r>
+    </w:p>
+    <w:p>
+      <w:pPr>
+        <w:ind w:firstLine="220"/>
+        <w:jc w:val="both"/>
+        <w:spacing w:after="120" w:line="360"/>
+      </w:pPr>
+      <w:r>
+        <w:rPr>
+          <w:rFonts w:ascii="바탕" w:eastAsia="바탕" w:hAnsi="바탕" w:cs="바탕"/>
+          <w:sz w:val="22"/>
+          <w:szCs w:val="22"/>
+        </w:rPr>
+        <w:t>위 회의록에 따르면 ① 위원회는 2023. 5. 2. 이전에 이미 순정축협으로부터 돈을 받아 그 용처를 위원들끼리 정하고 있었고, ② 금원을 지급한 순정축협의 시설에서 축협 직원의 사회로 회의를 열면서 축협 조합장을 위원회 임원으로 추천하였으며, ③ 위원회는 스스로를 "5개권역" 대표 조직으로 운영하였습니다. 다만 회의록의 "순정축협에서 받은 돈"이 1억 원 전부인지 일부인지, 법인 등록과 조합장의 임원 취임이 실제로 이루어졌는지는 회의록만으로 확인되지 않으므로 조사가 필요합니다.</w:t>
+      </w:r>
+    </w:p>
+    <w:p>
+      <w:pPr>
+        <w:ind w:firstLine="220"/>
+        <w:jc w:val="both"/>
+        <w:spacing w:after="120" w:line="360"/>
+      </w:pPr>
+      <w:r>
+        <w:rPr>
+          <w:rFonts w:ascii="바탕" w:eastAsia="바탕" w:hAnsi="바탕" w:cs="바탕"/>
+          <w:sz w:val="22"/>
+          <w:szCs w:val="22"/>
+        </w:rPr>
+        <w:t xml:space="preserve">한편 진정인이 확보한 위원회 회의록은 제2차(2023. 5. 2.)와 제4차(2023. 8. 30.) 2건뿐입니다. 회차 번호로 보아 제1차와 제3차 회의도 열렸을 것으로 보이나, 진정인은 그 회의록을 확보하지 못하였고 회의가 실제로 열렸는지도 확인하지 못하였습니다. 제1차 회의는 위원회 발족(2023. 1. 8.자 요청서 첨부목록에 "감곡면 환경 개선위원회 발족 결의안"이 기재되어 있음)과 위원 구성, 2023. 1. 30. 공동협약 체결 및 순정축협 금원의 수령 시점과 가까울 가능성이 있습니다. 제3차 회의는 2023. 5. 2.과 8. 30. 사이, 즉 퇴비사 신축허가 신청(2023. 5. 3.)과 "반대 의견 없음" 의견서 제출(2023. 7. 20.) 무렵에 열렸을 가능성이 있습니다. 따라서 제1차·제3차 회의록에 금원의 수령·용처 결정, 법인 등록, 퇴비사 신축에 대한 의견 등이 기재되어 있는지 확인이 필요합니다.</w:t>
       </w:r>
     </w:p>
     <w:p>
@@ -1117,7 +1132,7 @@
           <w:sz w:val="22"/>
           <w:szCs w:val="22"/>
         </w:rPr>
-        <w:t xml:space="preserve">먼저 위원회의 교섭 태도가 짧은 기간에 크게 달라진 경위를 확인할 필요가 있습니다. 2022. 7. 22.자 합의문에서 위원회 위원장과 5개 마을 이장단은 다음과 같이 결의하였습니다(증 제1호증).</w:t>
+        <w:t>먼저 위원회의 교섭 태도가 짧은 기간에 크게 달라진 경위를 확인할 필요가 있습니다. 2022. 7. 22.자 합의문에서 위원회 위원장과 5개 마을 이장단은 다음과 같이 결의하였습니다(증 제1호증).</w:t>
       </w:r>
     </w:p>
     <w:p>
@@ -1134,22 +1149,22 @@
           <w:sz w:val="22"/>
           <w:szCs w:val="22"/>
         </w:rPr>
-        <w:t xml:space="preserve">“만약 5개 부락 대표인 이장단에서 합의한 내용을 수용하지 않는다면 우리는 환경청 및 정읍시에 민원을 제시할 뿐 아니라 청와대 민생해결팀에 탄원과 아울러 … 민사적인 손상에 대한 보상청구는 물론 집단으로 실력행사를 다하기로 결의하였다.”</w:t>
-      </w:r>
-    </w:p>
-    <w:p>
-      <w:pPr>
-        <w:ind w:firstLine="220"/>
-        <w:jc w:val="both"/>
-        <w:spacing w:after="120" w:line="360"/>
-      </w:pPr>
-      <w:r>
-        <w:rPr>
-          <w:rFonts w:ascii="바탕" w:eastAsia="바탕" w:hAnsi="바탕" w:cs="바탕"/>
-          <w:sz w:val="22"/>
-          <w:szCs w:val="22"/>
-        </w:rPr>
-        <w:t xml:space="preserve">그런데 순정축협이 2023. 1. 17.자 공문에서 “환경개선위원회 운영비 후원(이사회 의결후 집행예정)”을 제시하고(증 제3호증), 그로부터 13일 뒤인 2023. 1. 30.자 공동협약서 제3항에서 위원회는 다음과 같이 약속하였습니다(증 제4호증).</w:t>
+        <w:t>“만약 5개 부락 대표인 이장단에서 합의한 내용을 수용하지 않는다면 우리는 환경청 및 정읍시에 민원을 제시할 뿐 아니라 청와대 민생해결팀에 탄원과 아울러 … 민사적인 손상에 대한 보상청구는 물론 집단으로 실력행사를 다하기로 결의하였다.”</w:t>
+      </w:r>
+    </w:p>
+    <w:p>
+      <w:pPr>
+        <w:ind w:firstLine="220"/>
+        <w:jc w:val="both"/>
+        <w:spacing w:after="120" w:line="360"/>
+      </w:pPr>
+      <w:r>
+        <w:rPr>
+          <w:rFonts w:ascii="바탕" w:eastAsia="바탕" w:hAnsi="바탕" w:cs="바탕"/>
+          <w:sz w:val="22"/>
+          <w:szCs w:val="22"/>
+        </w:rPr>
+        <w:t>그런데 순정축협이 2023. 1. 17.자 공문에서 “환경개선위원회 운영비 후원(이사회 의결후 집행예정)”을 제시하고(증 제3호증), 그로부터 13일 뒤인 2023. 1. 30.자 공동협약서 제3항에서 위원회는 다음과 같이 약속하였습니다(증 제4호증).</w:t>
       </w:r>
     </w:p>
     <w:p>
@@ -1166,22 +1181,22 @@
           <w:sz w:val="22"/>
           <w:szCs w:val="22"/>
         </w:rPr>
-        <w:t xml:space="preserve">“감곡면환경개선위원회는 순정축협이 가축분의 교반, 수거, 생산, 살포등 사업 진행이 원활히 될 수 있도록 협력한다.”</w:t>
-      </w:r>
-    </w:p>
-    <w:p>
-      <w:pPr>
-        <w:ind w:firstLine="220"/>
-        <w:jc w:val="both"/>
-        <w:spacing w:after="120" w:line="360"/>
-      </w:pPr>
-      <w:r>
-        <w:rPr>
-          <w:rFonts w:ascii="바탕" w:eastAsia="바탕" w:hAnsi="바탕" w:cs="바탕"/>
-          <w:sz w:val="22"/>
-          <w:szCs w:val="22"/>
-        </w:rPr>
-        <w:t xml:space="preserve">약 6개월 사이에 민원·탄원·손해배상 청구·집단 실력행사까지 결의하던 입장이 시설 운영자의 사업에 협력하는 입장으로 바뀐 것입니다. 진정인은 이 변화가 곧 범죄라고 단정하지 않습니다. 다만 이 변화가 시설 개선 약속에 따른 정상적인 합의의 결과인지, 아니면 운영비 후원 등 금원 지원 약속이 영향을 미친 것인지는 확인되어야 합니다.</w:t>
+        <w:t>“감곡면환경개선위원회는 순정축협이 가축분의 교반, 수거, 생산, 살포등 사업 진행이 원활히 될 수 있도록 협력한다.”</w:t>
+      </w:r>
+    </w:p>
+    <w:p>
+      <w:pPr>
+        <w:ind w:firstLine="220"/>
+        <w:jc w:val="both"/>
+        <w:spacing w:after="120" w:line="360"/>
+      </w:pPr>
+      <w:r>
+        <w:rPr>
+          <w:rFonts w:ascii="바탕" w:eastAsia="바탕" w:hAnsi="바탕" w:cs="바탕"/>
+          <w:sz w:val="22"/>
+          <w:szCs w:val="22"/>
+        </w:rPr>
+        <w:t>약 6개월 사이에 민원·탄원·손해배상 청구·집단 실력행사까지 결의하던 입장이 시설 운영자의 사업에 협력하는 입장으로 바뀐 것입니다. 진정인은 이 변화가 곧 범죄라고 단정하지 않습니다. 다만 이 변화가 시설 개선 약속에 따른 정상적인 합의의 결과인지, 아니면 운영비 후원 등 금원 지원 약속이 영향을 미친 것인지는 확인되어야 합니다.</w:t>
       </w:r>
     </w:p>
     <w:p>
@@ -1517,7 +1532,22 @@
           <w:sz w:val="22"/>
           <w:szCs w:val="22"/>
         </w:rPr>
-        <w:t xml:space="preserve">아울러 2023. 5. 2.자 회의록에 기재된 법인 등록 계획과 임원 구성(위원장·5개 마을 이장·마을기업 대표를 임원으로, 순정축협 조합장을 비상근 임원으로 추천)이 실제로 실행되었는지, 2023. 8. 30.자 회의에서 위원회가 "5개권역" 명칭을 쓰고 송완복을 5개권역 대표 촌장 겸 위원으로 선출한 경위와 권한, 그리고 위원회 자금의 용처를 위원들의 다수결로 정한 의결 내역을 확인하여 주시기 바랍니다(증 제13·14호증).</w:t>
+        <w:t>아울러 2023. 5. 2.자 회의록에 기재된 법인 등록 계획과 임원 구성(위원장·5개 마을 이장·마을기업 대표를 임원으로, 순정축협 조합장을 비상근 임원으로 추천)이 실제로 실행되었는지, 2023. 8. 30.자 회의에서 위원회가 "5개권역" 명칭을 쓰고 송완복을 5개권역 대표 촌장 겸 위원으로 선출한 경위와 권한, 그리고 위원회 자금의 용처를 위원들의 다수결로 정한 의결 내역을 확인하여 주시기 바랍니다(증 제13·14호증).</w:t>
+      </w:r>
+    </w:p>
+    <w:p>
+      <w:pPr>
+        <w:ind w:firstLine="220"/>
+        <w:jc w:val="both"/>
+        <w:spacing w:after="120" w:line="360"/>
+      </w:pPr>
+      <w:r>
+        <w:rPr>
+          <w:rFonts w:ascii="바탕" w:eastAsia="바탕" w:hAnsi="바탕" w:cs="바탕"/>
+          <w:sz w:val="22"/>
+          <w:szCs w:val="22"/>
+        </w:rPr>
+        <w:t xml:space="preserve">또한 위원회의 제1차·제3차 회의록과 제5차 이후 회의록이 있다면 원본 전체를 확보하여 주시기 바랍니다. 각 회의의 개최 일시·장소, 출석자(순정축협 임직원의 출석 여부 포함), 의결 내용, 특히 순정축협 금원의 수령 보고와 용처 결정, 법인 등록 및 임원 구성, 퇴비사 신축 관련 의견 제출에 관한 논의가 있었는지 확인하여 주시기 바랍니다. 회의록이 작성되지 않았거나 일부만 남아 있다면 그 경위도 확인하여 주시기 바랍니다.</w:t>
       </w:r>
     </w:p>
     <w:p>
@@ -1944,7 +1974,24 @@
           <w:sz w:val="22"/>
           <w:szCs w:val="22"/>
         </w:rPr>
-        <w:t>제12호증 사건 경과 타임라인 (2쪽. 2026. 10. 14. 기준 정리자료)</w:t>
+        <w:t>제12호증 사건 경과 타임라인 (2쪽. 2026. 10. 1</w:t>
+      </w:r>
+      <w:r>
+        <w:rPr>
+          <w:rFonts w:ascii="바탕" w:eastAsia="바탕" w:hAnsi="바탕" w:cs="바탕"/>
+          <w:sz w:val="22"/>
+          <w:szCs w:val="22"/>
+          <w:rtl w:val="off"/>
+        </w:rPr>
+        <w:t>6</w:t>
+      </w:r>
+      <w:r>
+        <w:rPr>
+          <w:rFonts w:ascii="바탕" w:eastAsia="바탕" w:hAnsi="바탕" w:cs="바탕"/>
+          <w:sz w:val="22"/>
+          <w:szCs w:val="22"/>
+        </w:rPr>
+        <w:t>. 기준 정리자료)</w:t>
       </w:r>
     </w:p>
     <w:p>
@@ -1958,7 +2005,7 @@
           <w:sz w:val="22"/>
           <w:szCs w:val="22"/>
         </w:rPr>
-        <w:t xml:space="preserve">제13호증 2023. 5. 2.자 제2차 감곡면환경개선위원회 회의록 (7쪽. 5쪽 의안 제4호 "순정축협에서 받은 돈", 6쪽 법인 임원 구성 및 조합장 비상근 임원 추천)</w:t>
+        <w:t>제13호증 2023. 5. 2.자 제2차 감곡면환경개선위원회 회의록 (7쪽. 5쪽 의안 제4호 "순정축협에서 받은 돈", 6쪽 법인 임원 구성 및 조합장 비상근 임원 추천)</w:t>
       </w:r>
     </w:p>
     <w:p>
@@ -1972,7 +2019,7 @@
           <w:sz w:val="22"/>
           <w:szCs w:val="22"/>
         </w:rPr>
-        <w:t xml:space="preserve">제14호증 2023. 8. 30.자 감곡면 5개권역 환경개선위원회(4차) 회의록 (2쪽. 위원회 자금 활용 결의, 송완복 5개권역 대표 촌장 선출·위원 위촉)</w:t>
+        <w:t>제14호증 2023. 8. 30.자 감곡면 5개권역 환경개선위원회(4차) 회의록 (2쪽. 위원회 자금 활용 결의, 송완복 5개권역 대표 촌장 선출·위원 위촉)</w:t>
       </w:r>
     </w:p>
     <w:sectPr>

</xml_diff>